<commit_message>
D5 for Table 3 modified to have combinations of ATC IV level instead of single ATC IV level and results based on simulated data updated
</commit_message>
<xml_diff>
--- a/i_test/test_D6_Tabella_3_2025/g_output/D6_Table_3.docx
+++ b/i_test/test_D6_Tabella_3_2025/g_output/D6_Table_3.docx
@@ -79,37 +79,37 @@
               <w:pStyle w:val="Normal"/>
             </w:pPr>
             <w:r>
-              <w:t>45</w:t>
-            </w:r>
-          </w:p>
-        </w:tc>
-        <w:tc>
-          <w:p>
-            <w:pPr>
-              <w:pStyle w:val="Normal"/>
-            </w:pPr>
-            <w:r>
-              <w:t>9</w:t>
-            </w:r>
-          </w:p>
-        </w:tc>
-        <w:tc>
-          <w:p>
-            <w:pPr>
-              <w:pStyle w:val="Normal"/>
-            </w:pPr>
-            <w:r>
-              <w:t>19</w:t>
-            </w:r>
-          </w:p>
-        </w:tc>
-        <w:tc>
-          <w:p>
-            <w:pPr>
-              <w:pStyle w:val="Normal"/>
-            </w:pPr>
-            <w:r>
-              <w:t>17</w:t>
+              <w:t>3035</w:t>
+            </w:r>
+          </w:p>
+        </w:tc>
+        <w:tc>
+          <w:p>
+            <w:pPr>
+              <w:pStyle w:val="Normal"/>
+            </w:pPr>
+            <w:r>
+              <w:t>1020</w:t>
+            </w:r>
+          </w:p>
+        </w:tc>
+        <w:tc>
+          <w:p>
+            <w:pPr>
+              <w:pStyle w:val="Normal"/>
+            </w:pPr>
+            <w:r>
+              <w:t>960</w:t>
+            </w:r>
+          </w:p>
+        </w:tc>
+        <w:tc>
+          <w:p>
+            <w:pPr>
+              <w:pStyle w:val="Normal"/>
+            </w:pPr>
+            <w:r>
+              <w:t>1055</w:t>
             </w:r>
           </w:p>
         </w:tc>
@@ -131,37 +131,37 @@
               <w:pStyle w:val="Normal"/>
             </w:pPr>
             <w:r>
-              <w:t>25 (55,6%)</w:t>
-            </w:r>
-          </w:p>
-        </w:tc>
-        <w:tc>
-          <w:p>
-            <w:pPr>
-              <w:pStyle w:val="Normal"/>
-            </w:pPr>
-            <w:r>
-              <w:t>6 (66,7%)</w:t>
-            </w:r>
-          </w:p>
-        </w:tc>
-        <w:tc>
-          <w:p>
-            <w:pPr>
-              <w:pStyle w:val="Normal"/>
-            </w:pPr>
-            <w:r>
-              <w:t>8 (42,1%)</w:t>
-            </w:r>
-          </w:p>
-        </w:tc>
-        <w:tc>
-          <w:p>
-            <w:pPr>
-              <w:pStyle w:val="Normal"/>
-            </w:pPr>
-            <w:r>
-              <w:t>11 (64,7%)</w:t>
+              <w:t>1.507 (49,7%)</w:t>
+            </w:r>
+          </w:p>
+        </w:tc>
+        <w:tc>
+          <w:p>
+            <w:pPr>
+              <w:pStyle w:val="Normal"/>
+            </w:pPr>
+            <w:r>
+              <w:t>497 (48,7%)</w:t>
+            </w:r>
+          </w:p>
+        </w:tc>
+        <w:tc>
+          <w:p>
+            <w:pPr>
+              <w:pStyle w:val="Normal"/>
+            </w:pPr>
+            <w:r>
+              <w:t>493 (51,4%)</w:t>
+            </w:r>
+          </w:p>
+        </w:tc>
+        <w:tc>
+          <w:p>
+            <w:pPr>
+              <w:pStyle w:val="Normal"/>
+            </w:pPr>
+            <w:r>
+              <w:t>517 (49,0%)</w:t>
             </w:r>
           </w:p>
         </w:tc>
@@ -183,37 +183,37 @@
               <w:pStyle w:val="Normal"/>
             </w:pPr>
             <w:r>
-              <w:t>13 (28,9%)</w:t>
-            </w:r>
-          </w:p>
-        </w:tc>
-        <w:tc>
-          <w:p>
-            <w:pPr>
-              <w:pStyle w:val="Normal"/>
-            </w:pPr>
-            <w:r>
-              <w:t>3 (33,3%)</w:t>
-            </w:r>
-          </w:p>
-        </w:tc>
-        <w:tc>
-          <w:p>
-            <w:pPr>
-              <w:pStyle w:val="Normal"/>
-            </w:pPr>
-            <w:r>
-              <w:t>5 (26,3%)</w:t>
-            </w:r>
-          </w:p>
-        </w:tc>
-        <w:tc>
-          <w:p>
-            <w:pPr>
-              <w:pStyle w:val="Normal"/>
-            </w:pPr>
-            <w:r>
-              <w:t>5 (29,4%)</w:t>
+              <w:t>1.051 (34,6%)</w:t>
+            </w:r>
+          </w:p>
+        </w:tc>
+        <w:tc>
+          <w:p>
+            <w:pPr>
+              <w:pStyle w:val="Normal"/>
+            </w:pPr>
+            <w:r>
+              <w:t>357 (35,0%)</w:t>
+            </w:r>
+          </w:p>
+        </w:tc>
+        <w:tc>
+          <w:p>
+            <w:pPr>
+              <w:pStyle w:val="Normal"/>
+            </w:pPr>
+            <w:r>
+              <w:t>342 (35,6%)</w:t>
+            </w:r>
+          </w:p>
+        </w:tc>
+        <w:tc>
+          <w:p>
+            <w:pPr>
+              <w:pStyle w:val="Normal"/>
+            </w:pPr>
+            <w:r>
+              <w:t>352 (33,4%)</w:t>
             </w:r>
           </w:p>
         </w:tc>
@@ -235,37 +235,37 @@
               <w:pStyle w:val="Normal"/>
             </w:pPr>
             <w:r>
-              <w:t>19 (42,2%)</w:t>
-            </w:r>
-          </w:p>
-        </w:tc>
-        <w:tc>
-          <w:p>
-            <w:pPr>
-              <w:pStyle w:val="Normal"/>
-            </w:pPr>
-            <w:r>
-              <w:t>5 (55,6%)</w:t>
-            </w:r>
-          </w:p>
-        </w:tc>
-        <w:tc>
-          <w:p>
-            <w:pPr>
-              <w:pStyle w:val="Normal"/>
-            </w:pPr>
-            <w:r>
-              <w:t>6 (31,6%)</w:t>
-            </w:r>
-          </w:p>
-        </w:tc>
-        <w:tc>
-          <w:p>
-            <w:pPr>
-              <w:pStyle w:val="Normal"/>
-            </w:pPr>
-            <w:r>
-              <w:t>8 (47,1%)</w:t>
+              <w:t>998 (32,9%)</w:t>
+            </w:r>
+          </w:p>
+        </w:tc>
+        <w:tc>
+          <w:p>
+            <w:pPr>
+              <w:pStyle w:val="Normal"/>
+            </w:pPr>
+            <w:r>
+              <w:t>330 (32,4%)</w:t>
+            </w:r>
+          </w:p>
+        </w:tc>
+        <w:tc>
+          <w:p>
+            <w:pPr>
+              <w:pStyle w:val="Normal"/>
+            </w:pPr>
+            <w:r>
+              <w:t>306 (31,9%)</w:t>
+            </w:r>
+          </w:p>
+        </w:tc>
+        <w:tc>
+          <w:p>
+            <w:pPr>
+              <w:pStyle w:val="Normal"/>
+            </w:pPr>
+            <w:r>
+              <w:t>362 (34,3%)</w:t>
             </w:r>
           </w:p>
         </w:tc>
@@ -287,37 +287,37 @@
               <w:pStyle w:val="Normal"/>
             </w:pPr>
             <w:r>
-              <w:t>13 (28,9%)</w:t>
-            </w:r>
-          </w:p>
-        </w:tc>
-        <w:tc>
-          <w:p>
-            <w:pPr>
-              <w:pStyle w:val="Normal"/>
-            </w:pPr>
-            <w:r>
-              <w:t>1 (11,1%)</w:t>
-            </w:r>
-          </w:p>
-        </w:tc>
-        <w:tc>
-          <w:p>
-            <w:pPr>
-              <w:pStyle w:val="Normal"/>
-            </w:pPr>
-            <w:r>
-              <w:t>8 (42,1%)</w:t>
-            </w:r>
-          </w:p>
-        </w:tc>
-        <w:tc>
-          <w:p>
-            <w:pPr>
-              <w:pStyle w:val="Normal"/>
-            </w:pPr>
-            <w:r>
-              <w:t>4 (23,5%)</w:t>
+              <w:t>986 (32,5%)</w:t>
+            </w:r>
+          </w:p>
+        </w:tc>
+        <w:tc>
+          <w:p>
+            <w:pPr>
+              <w:pStyle w:val="Normal"/>
+            </w:pPr>
+            <w:r>
+              <w:t>333 (32,6%)</w:t>
+            </w:r>
+          </w:p>
+        </w:tc>
+        <w:tc>
+          <w:p>
+            <w:pPr>
+              <w:pStyle w:val="Normal"/>
+            </w:pPr>
+            <w:r>
+              <w:t>312 (32,5%)</w:t>
+            </w:r>
+          </w:p>
+        </w:tc>
+        <w:tc>
+          <w:p>
+            <w:pPr>
+              <w:pStyle w:val="Normal"/>
+            </w:pPr>
+            <w:r>
+              <w:t>341 (32,3%)</w:t>
             </w:r>
           </w:p>
         </w:tc>
@@ -339,37 +339,37 @@
               <w:pStyle w:val="Normal"/>
             </w:pPr>
             <w:r>
-              <w:t>4 (8,9%)</w:t>
-            </w:r>
-          </w:p>
-        </w:tc>
-        <w:tc>
-          <w:p>
-            <w:pPr>
-              <w:pStyle w:val="Normal"/>
-            </w:pPr>
-            <w:r>
-              <w:t>3 (33,3%)</w:t>
-            </w:r>
-          </w:p>
-        </w:tc>
-        <w:tc>
-          <w:p>
-            <w:pPr>
-              <w:pStyle w:val="Normal"/>
-            </w:pPr>
-            <w:r>
-              <w:t>1 (5,3%)</w:t>
-            </w:r>
-          </w:p>
-        </w:tc>
-        <w:tc>
-          <w:p>
-            <w:pPr>
-              <w:pStyle w:val="Normal"/>
-            </w:pPr>
-            <w:r>
-              <w:t>0 (0,0%)</w:t>
+              <w:t>2.030 (66,9%)</w:t>
+            </w:r>
+          </w:p>
+        </w:tc>
+        <w:tc>
+          <w:p>
+            <w:pPr>
+              <w:pStyle w:val="Normal"/>
+            </w:pPr>
+            <w:r>
+              <w:t>692 (67,8%)</w:t>
+            </w:r>
+          </w:p>
+        </w:tc>
+        <w:tc>
+          <w:p>
+            <w:pPr>
+              <w:pStyle w:val="Normal"/>
+            </w:pPr>
+            <w:r>
+              <w:t>638 (66,5%)</w:t>
+            </w:r>
+          </w:p>
+        </w:tc>
+        <w:tc>
+          <w:p>
+            <w:pPr>
+              <w:pStyle w:val="Normal"/>
+            </w:pPr>
+            <w:r>
+              <w:t>700 (66,4%)</w:t>
             </w:r>
           </w:p>
         </w:tc>
@@ -443,37 +443,37 @@
               <w:pStyle w:val="Normal"/>
             </w:pPr>
             <w:r>
-              <w:t>28 (62,2%)</w:t>
-            </w:r>
-          </w:p>
-        </w:tc>
-        <w:tc>
-          <w:p>
-            <w:pPr>
-              <w:pStyle w:val="Normal"/>
-            </w:pPr>
-            <w:r>
-              <w:t>7 (77,8%)</w:t>
-            </w:r>
-          </w:p>
-        </w:tc>
-        <w:tc>
-          <w:p>
-            <w:pPr>
-              <w:pStyle w:val="Normal"/>
-            </w:pPr>
-            <w:r>
-              <w:t>11 (57,9%)</w:t>
-            </w:r>
-          </w:p>
-        </w:tc>
-        <w:tc>
-          <w:p>
-            <w:pPr>
-              <w:pStyle w:val="Normal"/>
-            </w:pPr>
-            <w:r>
-              <w:t>10 (58,8%)</w:t>
+              <w:t>1.485 (48,9%)</w:t>
+            </w:r>
+          </w:p>
+        </w:tc>
+        <w:tc>
+          <w:p>
+            <w:pPr>
+              <w:pStyle w:val="Normal"/>
+            </w:pPr>
+            <w:r>
+              <w:t>500 (49,0%)</w:t>
+            </w:r>
+          </w:p>
+        </w:tc>
+        <w:tc>
+          <w:p>
+            <w:pPr>
+              <w:pStyle w:val="Normal"/>
+            </w:pPr>
+            <w:r>
+              <w:t>454 (47,3%)</w:t>
+            </w:r>
+          </w:p>
+        </w:tc>
+        <w:tc>
+          <w:p>
+            <w:pPr>
+              <w:pStyle w:val="Normal"/>
+            </w:pPr>
+            <w:r>
+              <w:t>531 (50,3%)</w:t>
             </w:r>
           </w:p>
         </w:tc>
@@ -495,37 +495,37 @@
               <w:pStyle w:val="Normal"/>
             </w:pPr>
             <w:r>
-              <w:t>5 (11,1%)</w:t>
-            </w:r>
-          </w:p>
-        </w:tc>
-        <w:tc>
-          <w:p>
-            <w:pPr>
-              <w:pStyle w:val="Normal"/>
-            </w:pPr>
-            <w:r>
-              <w:t>1 (11,1%)</w:t>
-            </w:r>
-          </w:p>
-        </w:tc>
-        <w:tc>
-          <w:p>
-            <w:pPr>
-              <w:pStyle w:val="Normal"/>
-            </w:pPr>
-            <w:r>
-              <w:t>1 (5,3%)</w:t>
-            </w:r>
-          </w:p>
-        </w:tc>
-        <w:tc>
-          <w:p>
-            <w:pPr>
-              <w:pStyle w:val="Normal"/>
-            </w:pPr>
-            <w:r>
-              <w:t>3 (17,6%)</w:t>
+              <w:t>541 (17,8%)</w:t>
+            </w:r>
+          </w:p>
+        </w:tc>
+        <w:tc>
+          <w:p>
+            <w:pPr>
+              <w:pStyle w:val="Normal"/>
+            </w:pPr>
+            <w:r>
+              <w:t>171 (16,8%)</w:t>
+            </w:r>
+          </w:p>
+        </w:tc>
+        <w:tc>
+          <w:p>
+            <w:pPr>
+              <w:pStyle w:val="Normal"/>
+            </w:pPr>
+            <w:r>
+              <w:t>161 (16,8%)</w:t>
+            </w:r>
+          </w:p>
+        </w:tc>
+        <w:tc>
+          <w:p>
+            <w:pPr>
+              <w:pStyle w:val="Normal"/>
+            </w:pPr>
+            <w:r>
+              <w:t>209 (19,8%)</w:t>
             </w:r>
           </w:p>
         </w:tc>
@@ -547,37 +547,37 @@
               <w:pStyle w:val="Normal"/>
             </w:pPr>
             <w:r>
-              <w:t>27 (60,0%)</w:t>
-            </w:r>
-          </w:p>
-        </w:tc>
-        <w:tc>
-          <w:p>
-            <w:pPr>
-              <w:pStyle w:val="Normal"/>
-            </w:pPr>
-            <w:r>
-              <w:t>9 (100,0%)</w:t>
-            </w:r>
-          </w:p>
-        </w:tc>
-        <w:tc>
-          <w:p>
-            <w:pPr>
-              <w:pStyle w:val="Normal"/>
-            </w:pPr>
-            <w:r>
-              <w:t>10 (52,6%)</w:t>
-            </w:r>
-          </w:p>
-        </w:tc>
-        <w:tc>
-          <w:p>
-            <w:pPr>
-              <w:pStyle w:val="Normal"/>
-            </w:pPr>
-            <w:r>
-              <w:t>8 (47,1%)</w:t>
+              <w:t>1.978 (65,2%)</w:t>
+            </w:r>
+          </w:p>
+        </w:tc>
+        <w:tc>
+          <w:p>
+            <w:pPr>
+              <w:pStyle w:val="Normal"/>
+            </w:pPr>
+            <w:r>
+              <w:t>665 (65,2%)</w:t>
+            </w:r>
+          </w:p>
+        </w:tc>
+        <w:tc>
+          <w:p>
+            <w:pPr>
+              <w:pStyle w:val="Normal"/>
+            </w:pPr>
+            <w:r>
+              <w:t>640 (66,7%)</w:t>
+            </w:r>
+          </w:p>
+        </w:tc>
+        <w:tc>
+          <w:p>
+            <w:pPr>
+              <w:pStyle w:val="Normal"/>
+            </w:pPr>
+            <w:r>
+              <w:t>673 (63,8%)</w:t>
             </w:r>
           </w:p>
         </w:tc>
@@ -599,37 +599,37 @@
               <w:pStyle w:val="Normal"/>
             </w:pPr>
             <w:r>
-              <w:t>14 (31,1%)</w:t>
-            </w:r>
-          </w:p>
-        </w:tc>
-        <w:tc>
-          <w:p>
-            <w:pPr>
-              <w:pStyle w:val="Normal"/>
-            </w:pPr>
-            <w:r>
-              <w:t>3 (33,3%)</w:t>
-            </w:r>
-          </w:p>
-        </w:tc>
-        <w:tc>
-          <w:p>
-            <w:pPr>
-              <w:pStyle w:val="Normal"/>
-            </w:pPr>
-            <w:r>
-              <w:t>5 (26,3%)</w:t>
-            </w:r>
-          </w:p>
-        </w:tc>
-        <w:tc>
-          <w:p>
-            <w:pPr>
-              <w:pStyle w:val="Normal"/>
-            </w:pPr>
-            <w:r>
-              <w:t>6 (35,3%)</w:t>
+              <w:t>1.710 (56,3%)</w:t>
+            </w:r>
+          </w:p>
+        </w:tc>
+        <w:tc>
+          <w:p>
+            <w:pPr>
+              <w:pStyle w:val="Normal"/>
+            </w:pPr>
+            <w:r>
+              <w:t>571 (56,0%)</w:t>
+            </w:r>
+          </w:p>
+        </w:tc>
+        <w:tc>
+          <w:p>
+            <w:pPr>
+              <w:pStyle w:val="Normal"/>
+            </w:pPr>
+            <w:r>
+              <w:t>549 (57,2%)</w:t>
+            </w:r>
+          </w:p>
+        </w:tc>
+        <w:tc>
+          <w:p>
+            <w:pPr>
+              <w:pStyle w:val="Normal"/>
+            </w:pPr>
+            <w:r>
+              <w:t>590 (55,9%)</w:t>
             </w:r>
           </w:p>
         </w:tc>
@@ -703,37 +703,37 @@
               <w:pStyle w:val="Normal"/>
             </w:pPr>
             <w:r>
-              <w:t>A10BD15 20 (44,4%)</w:t>
-            </w:r>
-          </w:p>
-        </w:tc>
-        <w:tc>
-          <w:p>
-            <w:pPr>
-              <w:pStyle w:val="Normal"/>
-            </w:pPr>
-            <w:r>
-              <w:t>A10BD15 7 (77,8%)</w:t>
-            </w:r>
-          </w:p>
-        </w:tc>
-        <w:tc>
-          <w:p>
-            <w:pPr>
-              <w:pStyle w:val="Normal"/>
-            </w:pPr>
-            <w:r>
-              <w:t>A10AE56 11 (57,9%)</w:t>
-            </w:r>
-          </w:p>
-        </w:tc>
-        <w:tc>
-          <w:p>
-            <w:pPr>
-              <w:pStyle w:val="Normal"/>
-            </w:pPr>
-            <w:r>
-              <w:t>A10BJ 9 (52,9%)</w:t>
+              <w:t>J10JE54 201 (6,6%)</w:t>
+            </w:r>
+          </w:p>
+        </w:tc>
+        <w:tc>
+          <w:p>
+            <w:pPr>
+              <w:pStyle w:val="Normal"/>
+            </w:pPr>
+            <w:r>
+              <w:t>A10BD07 77 (7,5%)</w:t>
+            </w:r>
+          </w:p>
+        </w:tc>
+        <w:tc>
+          <w:p>
+            <w:pPr>
+              <w:pStyle w:val="Normal"/>
+            </w:pPr>
+            <w:r>
+              <w:t>B10BX16 74 (7,7%)</w:t>
+            </w:r>
+          </w:p>
+        </w:tc>
+        <w:tc>
+          <w:p>
+            <w:pPr>
+              <w:pStyle w:val="Normal"/>
+            </w:pPr>
+            <w:r>
+              <w:t>J10JE54 84 (8,0%)</w:t>
             </w:r>
           </w:p>
         </w:tc>
@@ -755,37 +755,37 @@
               <w:pStyle w:val="Normal"/>
             </w:pPr>
             <w:r>
-              <w:t>A10BD07 20 (44,4%)</w:t>
-            </w:r>
-          </w:p>
-        </w:tc>
-        <w:tc>
-          <w:p>
-            <w:pPr>
-              <w:pStyle w:val="Normal"/>
-            </w:pPr>
-            <w:r>
-              <w:t>A10BD24 5 (55,6%)</w:t>
-            </w:r>
-          </w:p>
-        </w:tc>
-        <w:tc>
-          <w:p>
-            <w:pPr>
-              <w:pStyle w:val="Normal"/>
-            </w:pPr>
-            <w:r>
-              <w:t>A10BD09 10 (52,6%)</w:t>
-            </w:r>
-          </w:p>
-        </w:tc>
-        <w:tc>
-          <w:p>
-            <w:pPr>
-              <w:pStyle w:val="Normal"/>
-            </w:pPr>
-            <w:r>
-              <w:t>A10BD15 9 (52,9%)</w:t>
+              <w:t>B10BD19 199 (6,6%)</w:t>
+            </w:r>
+          </w:p>
+        </w:tc>
+        <w:tc>
+          <w:p>
+            <w:pPr>
+              <w:pStyle w:val="Normal"/>
+            </w:pPr>
+            <w:r>
+              <w:t>C10BD20 75 (7,4%)</w:t>
+            </w:r>
+          </w:p>
+        </w:tc>
+        <w:tc>
+          <w:p>
+            <w:pPr>
+              <w:pStyle w:val="Normal"/>
+            </w:pPr>
+            <w:r>
+              <w:t>D10DE54 68 (7,1%)</w:t>
+            </w:r>
+          </w:p>
+        </w:tc>
+        <w:tc>
+          <w:p>
+            <w:pPr>
+              <w:pStyle w:val="Normal"/>
+            </w:pPr>
+            <w:r>
+              <w:t>D10BD07 79 (7,5%)</w:t>
             </w:r>
           </w:p>
         </w:tc>
@@ -807,37 +807,37 @@
               <w:pStyle w:val="Normal"/>
             </w:pPr>
             <w:r>
-              <w:t>A10AE56 20 (44,4%)</w:t>
-            </w:r>
-          </w:p>
-        </w:tc>
-        <w:tc>
-          <w:p>
-            <w:pPr>
-              <w:pStyle w:val="Normal"/>
-            </w:pPr>
-            <w:r>
-              <w:t>A10BD16 4 (44,4%)</w:t>
-            </w:r>
-          </w:p>
-        </w:tc>
-        <w:tc>
-          <w:p>
-            <w:pPr>
-              <w:pStyle w:val="Normal"/>
-            </w:pPr>
-            <w:r>
-              <w:t>A10BD07 9 (47,4%)</w:t>
-            </w:r>
-          </w:p>
-        </w:tc>
-        <w:tc>
-          <w:p>
-            <w:pPr>
-              <w:pStyle w:val="Normal"/>
-            </w:pPr>
-            <w:r>
-              <w:t>A10BH 9 (52,9%)</w:t>
+              <w:t>A10BD07 194 (6,4%)</w:t>
+            </w:r>
+          </w:p>
+        </w:tc>
+        <w:tc>
+          <w:p>
+            <w:pPr>
+              <w:pStyle w:val="Normal"/>
+            </w:pPr>
+            <w:r>
+              <w:t>A10BD09 73 (7,2%)</w:t>
+            </w:r>
+          </w:p>
+        </w:tc>
+        <w:tc>
+          <w:p>
+            <w:pPr>
+              <w:pStyle w:val="Normal"/>
+            </w:pPr>
+            <w:r>
+              <w:t>C10BD23 67 (7,0%)</w:t>
+            </w:r>
+          </w:p>
+        </w:tc>
+        <w:tc>
+          <w:p>
+            <w:pPr>
+              <w:pStyle w:val="Normal"/>
+            </w:pPr>
+            <w:r>
+              <w:t>A10BH02 78 (7,4%)</w:t>
             </w:r>
           </w:p>
         </w:tc>
@@ -859,37 +859,37 @@
               <w:pStyle w:val="Normal"/>
             </w:pPr>
             <w:r>
-              <w:t>A10BH 19 (42,2%)</w:t>
-            </w:r>
-          </w:p>
-        </w:tc>
-        <w:tc>
-          <w:p>
-            <w:pPr>
-              <w:pStyle w:val="Normal"/>
-            </w:pPr>
-            <w:r>
-              <w:t>A10BH 4 (44,4%)</w:t>
-            </w:r>
-          </w:p>
-        </w:tc>
-        <w:tc>
-          <w:p>
-            <w:pPr>
-              <w:pStyle w:val="Normal"/>
-            </w:pPr>
-            <w:r>
-              <w:t>A10AE54 8 (42,1%)</w:t>
-            </w:r>
-          </w:p>
-        </w:tc>
-        <w:tc>
-          <w:p>
-            <w:pPr>
-              <w:pStyle w:val="Normal"/>
-            </w:pPr>
-            <w:r>
-              <w:t>A10BD21 8 (47,1%)</w:t>
+              <w:t>B10AE54 193 (6,4%)</w:t>
+            </w:r>
+          </w:p>
+        </w:tc>
+        <w:tc>
+          <w:p>
+            <w:pPr>
+              <w:pStyle w:val="Normal"/>
+            </w:pPr>
+            <w:r>
+              <w:t>J10BD20 72 (7,1%)</w:t>
+            </w:r>
+          </w:p>
+        </w:tc>
+        <w:tc>
+          <w:p>
+            <w:pPr>
+              <w:pStyle w:val="Normal"/>
+            </w:pPr>
+            <w:r>
+              <w:t>B10BD19 67 (7,0%)</w:t>
+            </w:r>
+          </w:p>
+        </w:tc>
+        <w:tc>
+          <w:p>
+            <w:pPr>
+              <w:pStyle w:val="Normal"/>
+            </w:pPr>
+            <w:r>
+              <w:t>B10BD20 77 (7,3%)</w:t>
             </w:r>
           </w:p>
         </w:tc>
@@ -911,37 +911,37 @@
               <w:pStyle w:val="Normal"/>
             </w:pPr>
             <w:r>
-              <w:t>A10BD16 18 (40,0%)</w:t>
-            </w:r>
-          </w:p>
-        </w:tc>
-        <w:tc>
-          <w:p>
-            <w:pPr>
-              <w:pStyle w:val="Normal"/>
-            </w:pPr>
-            <w:r>
-              <w:t>A10BD21 4 (44,4%)</w:t>
-            </w:r>
-          </w:p>
-        </w:tc>
-        <w:tc>
-          <w:p>
-            <w:pPr>
-              <w:pStyle w:val="Normal"/>
-            </w:pPr>
-            <w:r>
-              <w:t>A10BD11 8 (42,1%)</w:t>
-            </w:r>
-          </w:p>
-        </w:tc>
-        <w:tc>
-          <w:p>
-            <w:pPr>
-              <w:pStyle w:val="Normal"/>
-            </w:pPr>
-            <w:r>
-              <w:t>A10BD08 8 (47,1%)</w:t>
+              <w:t>B10BX16 193 (6,4%)</w:t>
+            </w:r>
+          </w:p>
+        </w:tc>
+        <w:tc>
+          <w:p>
+            <w:pPr>
+              <w:pStyle w:val="Normal"/>
+            </w:pPr>
+            <w:r>
+              <w:t>A10BD21 72 (7,1%)</w:t>
+            </w:r>
+          </w:p>
+        </w:tc>
+        <w:tc>
+          <w:p>
+            <w:pPr>
+              <w:pStyle w:val="Normal"/>
+            </w:pPr>
+            <w:r>
+              <w:t>C10BD11 66 (6,9%)</w:t>
+            </w:r>
+          </w:p>
+        </w:tc>
+        <w:tc>
+          <w:p>
+            <w:pPr>
+              <w:pStyle w:val="Normal"/>
+            </w:pPr>
+            <w:r>
+              <w:t>B10BD15 73 (6,9%)</w:t>
             </w:r>
           </w:p>
         </w:tc>
@@ -1015,37 +1015,37 @@
               <w:pStyle w:val="Normal"/>
             </w:pPr>
             <w:r>
-              <w:t>A10BD 45 (100,0%)</w:t>
-            </w:r>
-          </w:p>
-        </w:tc>
-        <w:tc>
-          <w:p>
-            <w:pPr>
-              <w:pStyle w:val="Normal"/>
-            </w:pPr>
-            <w:r>
-              <w:t>A10BD 9 (100,0%)</w:t>
-            </w:r>
-          </w:p>
-        </w:tc>
-        <w:tc>
-          <w:p>
-            <w:pPr>
-              <w:pStyle w:val="Normal"/>
-            </w:pPr>
-            <w:r>
-              <w:t>A10BD 19 (100,0%)</w:t>
-            </w:r>
-          </w:p>
-        </w:tc>
-        <w:tc>
-          <w:p>
-            <w:pPr>
-              <w:pStyle w:val="Normal"/>
-            </w:pPr>
-            <w:r>
-              <w:t>A10BD 17 (100,0%)</w:t>
+              <w:t>A10BD B10BD C10BD J10BD M10BD 15 (0,5%)</w:t>
+            </w:r>
+          </w:p>
+        </w:tc>
+        <w:tc>
+          <w:p>
+            <w:pPr>
+              <w:pStyle w:val="Normal"/>
+            </w:pPr>
+            <w:r>
+              <w:t>A10BD B10BD C10BD J10BD M10BD 4 (0,4%)</w:t>
+            </w:r>
+          </w:p>
+        </w:tc>
+        <w:tc>
+          <w:p>
+            <w:pPr>
+              <w:pStyle w:val="Normal"/>
+            </w:pPr>
+            <w:r>
+              <w:t>A10BD B10BD C10BD D10BD J10BD 6 (0,6%)</w:t>
+            </w:r>
+          </w:p>
+        </w:tc>
+        <w:tc>
+          <w:p>
+            <w:pPr>
+              <w:pStyle w:val="Normal"/>
+            </w:pPr>
+            <w:r>
+              <w:t>A10BD B10BD C10BD J10BD M10BD 7 (0,7%)</w:t>
             </w:r>
           </w:p>
         </w:tc>
@@ -1067,37 +1067,37 @@
               <w:pStyle w:val="Normal"/>
             </w:pPr>
             <w:r>
-              <w:t>A10AE 27 (60,0%)</w:t>
-            </w:r>
-          </w:p>
-        </w:tc>
-        <w:tc>
-          <w:p>
-            <w:pPr>
-              <w:pStyle w:val="Normal"/>
-            </w:pPr>
-            <w:r>
-              <w:t>A10BH 4 (44,4%)</w:t>
-            </w:r>
-          </w:p>
-        </w:tc>
-        <w:tc>
-          <w:p>
-            <w:pPr>
-              <w:pStyle w:val="Normal"/>
-            </w:pPr>
-            <w:r>
-              <w:t>A10AE 13 (68,4%)</w:t>
-            </w:r>
-          </w:p>
-        </w:tc>
-        <w:tc>
-          <w:p>
-            <w:pPr>
-              <w:pStyle w:val="Normal"/>
-            </w:pPr>
-            <w:r>
-              <w:t>A10AE 11 (64,7%)</w:t>
+              <w:t>A10BD B10BD C10BD D10BD J10BD 12 (0,4%)</w:t>
+            </w:r>
+          </w:p>
+        </w:tc>
+        <w:tc>
+          <w:p>
+            <w:pPr>
+              <w:pStyle w:val="Normal"/>
+            </w:pPr>
+            <w:r>
+              <w:t>A10BD B10BD C10BD D10BD J10BD 4 (0,4%)</w:t>
+            </w:r>
+          </w:p>
+        </w:tc>
+        <w:tc>
+          <w:p>
+            <w:pPr>
+              <w:pStyle w:val="Normal"/>
+            </w:pPr>
+            <w:r>
+              <w:t>A10BD C10BD D10BD J10BD M10BD 4 (0,4%)</w:t>
+            </w:r>
+          </w:p>
+        </w:tc>
+        <w:tc>
+          <w:p>
+            <w:pPr>
+              <w:pStyle w:val="Normal"/>
+            </w:pPr>
+            <w:r>
+              <w:t>A10BD B10BD C10BD D10BD J10BD M10BD 5 (0,5%)</w:t>
             </w:r>
           </w:p>
         </w:tc>
@@ -1119,37 +1119,37 @@
               <w:pStyle w:val="Normal"/>
             </w:pPr>
             <w:r>
-              <w:t>A10BH 16 (35,6%)</w:t>
-            </w:r>
-          </w:p>
-        </w:tc>
-        <w:tc>
-          <w:p>
-            <w:pPr>
-              <w:pStyle w:val="Normal"/>
-            </w:pPr>
-            <w:r>
-              <w:t>A10AE 3 (33,3%)</w:t>
-            </w:r>
-          </w:p>
-        </w:tc>
-        <w:tc>
-          <w:p>
-            <w:pPr>
-              <w:pStyle w:val="Normal"/>
-            </w:pPr>
-            <w:r>
-              <w:t>A10BH 5 (26,3%)</w:t>
-            </w:r>
-          </w:p>
-        </w:tc>
-        <w:tc>
-          <w:p>
-            <w:pPr>
-              <w:pStyle w:val="Normal"/>
-            </w:pPr>
-            <w:r>
-              <w:t>A10BJ 7 (41,2%)</w:t>
+              <w:t>A10BD B10BD C10BD D10BD J10BD M10BD 10 (0,3%)</w:t>
+            </w:r>
+          </w:p>
+        </w:tc>
+        <w:tc>
+          <w:p>
+            <w:pPr>
+              <w:pStyle w:val="Normal"/>
+            </w:pPr>
+            <w:r>
+              <w:t>A10BD B10BD C10BD D10BD J10BD M10BD M10ME 2 (0,2%)</w:t>
+            </w:r>
+          </w:p>
+        </w:tc>
+        <w:tc>
+          <w:p>
+            <w:pPr>
+              <w:pStyle w:val="Normal"/>
+            </w:pPr>
+            <w:r>
+              <w:t>A10BD B10BD C10BD J10BD M10BD 4 (0,4%)</w:t>
+            </w:r>
+          </w:p>
+        </w:tc>
+        <w:tc>
+          <w:p>
+            <w:pPr>
+              <w:pStyle w:val="Normal"/>
+            </w:pPr>
+            <w:r>
+              <w:t>B10BD C10BD D10BD J10BD M10BD 3 (0,3%)</w:t>
             </w:r>
           </w:p>
         </w:tc>
@@ -1171,37 +1171,37 @@
               <w:pStyle w:val="Normal"/>
             </w:pPr>
             <w:r>
-              <w:t>A10BJ 15 (33,3%)</w:t>
-            </w:r>
-          </w:p>
-        </w:tc>
-        <w:tc>
-          <w:p>
-            <w:pPr>
-              <w:pStyle w:val="Normal"/>
-            </w:pPr>
-            <w:r>
-              <w:t>A10BJ 3 (33,3%)</w:t>
-            </w:r>
-          </w:p>
-        </w:tc>
-        <w:tc>
-          <w:p>
-            <w:pPr>
-              <w:pStyle w:val="Normal"/>
-            </w:pPr>
-            <w:r>
-              <w:t>A10BK 5 (26,3%)</w:t>
-            </w:r>
-          </w:p>
-        </w:tc>
-        <w:tc>
-          <w:p>
-            <w:pPr>
-              <w:pStyle w:val="Normal"/>
-            </w:pPr>
-            <w:r>
-              <w:t>A10BH 7 (41,2%)</w:t>
+              <w:t>B10BD C10BD D10BD J10BD M10BD 7 (0,2%)</w:t>
+            </w:r>
+          </w:p>
+        </w:tc>
+        <w:tc>
+          <w:p>
+            <w:pPr>
+              <w:pStyle w:val="Normal"/>
+            </w:pPr>
+            <w:r>
+              <w:t>A10BD B10BD C10BD C10BK J10BD M10BD 2 (0,2%)</w:t>
+            </w:r>
+          </w:p>
+        </w:tc>
+        <w:tc>
+          <w:p>
+            <w:pPr>
+              <w:pStyle w:val="Normal"/>
+            </w:pPr>
+            <w:r>
+              <w:t>B10BD C10BD D10BD J10BD M10BD 4 (0,4%)</w:t>
+            </w:r>
+          </w:p>
+        </w:tc>
+        <w:tc>
+          <w:p>
+            <w:pPr>
+              <w:pStyle w:val="Normal"/>
+            </w:pPr>
+            <w:r>
+              <w:t>A10BD B10BD C10BD D10BD M10BD 3 (0,3%)</w:t>
             </w:r>
           </w:p>
         </w:tc>
@@ -1223,37 +1223,37 @@
               <w:pStyle w:val="Normal"/>
             </w:pPr>
             <w:r>
-              <w:t>A10BK 12 (26,7%)</w:t>
-            </w:r>
-          </w:p>
-        </w:tc>
-        <w:tc>
-          <w:p>
-            <w:pPr>
-              <w:pStyle w:val="Normal"/>
-            </w:pPr>
-            <w:r>
-              <w:t>A10BX 2 (22,2%)</w:t>
-            </w:r>
-          </w:p>
-        </w:tc>
-        <w:tc>
-          <w:p>
-            <w:pPr>
-              <w:pStyle w:val="Normal"/>
-            </w:pPr>
-            <w:r>
-              <w:t>A10BJ 5 (26,3%)</w:t>
-            </w:r>
-          </w:p>
-        </w:tc>
-        <w:tc>
-          <w:p>
-            <w:pPr>
-              <w:pStyle w:val="Normal"/>
-            </w:pPr>
-            <w:r>
-              <w:t>A10BK 6 (35,3%)</w:t>
+              <w:t>A10BD C10BD D10BD J10BD M10BD 7 (0,2%)</w:t>
+            </w:r>
+          </w:p>
+        </w:tc>
+        <w:tc>
+          <w:p>
+            <w:pPr>
+              <w:pStyle w:val="Normal"/>
+            </w:pPr>
+            <w:r>
+              <w:t>A10BD B10BD C10BD D10BD D10DE M10BD 2 (0,2%)</w:t>
+            </w:r>
+          </w:p>
+        </w:tc>
+        <w:tc>
+          <w:p>
+            <w:pPr>
+              <w:pStyle w:val="Normal"/>
+            </w:pPr>
+            <w:r>
+              <w:t>A10AE B10BD C10BD D10BD J10BD M10BD 3 (0,3%)</w:t>
+            </w:r>
+          </w:p>
+        </w:tc>
+        <w:tc>
+          <w:p>
+            <w:pPr>
+              <w:pStyle w:val="Normal"/>
+            </w:pPr>
+            <w:r>
+              <w:t>B10BJ C10BD D10BD J10BD M10BD 2 (0,2%)</w:t>
             </w:r>
           </w:p>
         </w:tc>

</xml_diff>